<commit_message>
Atualização código para submeter relatórios finais reais
</commit_message>
<xml_diff>
--- a/03_Implementacao/uploads/ficheiros/3. Termo de juntada docs..docx
+++ b/03_Implementacao/uploads/ficheiros/3. Termo de juntada docs..docx
@@ -190,6 +190,14 @@
           <w:sz w:val="22"/>
           <w:szCs w:val="22"/>
         </w:rPr>
+        <w:fldChar w:fldCharType="begin">
+          <w:ffData>
+            <w:name w:val="Texto1"/>
+            <w:enabled/>
+            <w:calcOnExit w:val="0"/>
+            <w:textInput/>
+          </w:ffData>
+        </w:fldChar>
       </w:r>
       <w:bookmarkStart w:id="0" w:name="Texto1"/>
       <w:r>
@@ -200,6 +208,7 @@
           <w:sz w:val="22"/>
           <w:szCs w:val="22"/>
         </w:rPr>
+        <w:instrText xml:space="preserve"> FORMTEXT </w:instrText>
       </w:r>
       <w:r>
         <w:rPr>
@@ -218,6 +227,7 @@
           <w:sz w:val="22"/>
           <w:szCs w:val="22"/>
         </w:rPr>
+        <w:fldChar w:fldCharType="separate"/>
       </w:r>
       <w:r>
         <w:rPr>
@@ -270,6 +280,7 @@
           <w:sz w:val="22"/>
           <w:szCs w:val="22"/>
         </w:rPr>
+        <w:fldChar w:fldCharType="end"/>
       </w:r>
       <w:bookmarkEnd w:id="0"/>
     </w:p>
@@ -305,30 +316,40 @@
           <w:sz w:val="22"/>
           <w:szCs w:val="22"/>
         </w:rPr>
-      </w:r>
-      <w:r>
-        <w:rPr>
-          <w:rFonts w:ascii="Arial" w:hAnsi="Arial" w:cs="Arial"/>
-          <w:bCs/>
-          <w:sz w:val="22"/>
-          <w:szCs w:val="22"/>
-        </w:rPr>
-      </w:r>
-      <w:r>
-        <w:rPr>
-          <w:rFonts w:ascii="Arial" w:hAnsi="Arial" w:cs="Arial"/>
-          <w:bCs/>
-          <w:sz w:val="22"/>
-          <w:szCs w:val="22"/>
-        </w:rPr>
-      </w:r>
-      <w:r>
-        <w:rPr>
-          <w:rFonts w:ascii="Arial" w:hAnsi="Arial" w:cs="Arial"/>
-          <w:bCs/>
-          <w:sz w:val="22"/>
-          <w:szCs w:val="22"/>
-        </w:rPr>
+        <w:fldChar w:fldCharType="begin">
+          <w:ffData>
+            <w:name w:val="Texto1"/>
+            <w:enabled/>
+            <w:calcOnExit w:val="0"/>
+            <w:textInput/>
+          </w:ffData>
+        </w:fldChar>
+      </w:r>
+      <w:r>
+        <w:rPr>
+          <w:rFonts w:ascii="Arial" w:hAnsi="Arial" w:cs="Arial"/>
+          <w:bCs/>
+          <w:sz w:val="22"/>
+          <w:szCs w:val="22"/>
+        </w:rPr>
+        <w:instrText xml:space="preserve"> FORMTEXT </w:instrText>
+      </w:r>
+      <w:r>
+        <w:rPr>
+          <w:rFonts w:ascii="Arial" w:hAnsi="Arial" w:cs="Arial"/>
+          <w:bCs/>
+          <w:sz w:val="22"/>
+          <w:szCs w:val="22"/>
+        </w:rPr>
+      </w:r>
+      <w:r>
+        <w:rPr>
+          <w:rFonts w:ascii="Arial" w:hAnsi="Arial" w:cs="Arial"/>
+          <w:bCs/>
+          <w:sz w:val="22"/>
+          <w:szCs w:val="22"/>
+        </w:rPr>
+        <w:fldChar w:fldCharType="separate"/>
       </w:r>
       <w:r>
         <w:rPr>
@@ -367,6 +388,7 @@
           <w:sz w:val="22"/>
           <w:szCs w:val="22"/>
         </w:rPr>
+        <w:fldChar w:fldCharType="end"/>
       </w:r>
     </w:p>
     <w:p>
@@ -488,30 +510,40 @@
           <w:sz w:val="22"/>
           <w:szCs w:val="22"/>
         </w:rPr>
-      </w:r>
-      <w:r>
-        <w:rPr>
-          <w:rFonts w:ascii="Arial" w:hAnsi="Arial" w:cs="Arial"/>
-          <w:bCs/>
-          <w:sz w:val="22"/>
-          <w:szCs w:val="22"/>
-        </w:rPr>
-      </w:r>
-      <w:r>
-        <w:rPr>
-          <w:rFonts w:ascii="Arial" w:hAnsi="Arial" w:cs="Arial"/>
-          <w:bCs/>
-          <w:sz w:val="22"/>
-          <w:szCs w:val="22"/>
-        </w:rPr>
-      </w:r>
-      <w:r>
-        <w:rPr>
-          <w:rFonts w:ascii="Arial" w:hAnsi="Arial" w:cs="Arial"/>
-          <w:bCs/>
-          <w:sz w:val="22"/>
-          <w:szCs w:val="22"/>
-        </w:rPr>
+        <w:fldChar w:fldCharType="begin">
+          <w:ffData>
+            <w:name w:val="Texto1"/>
+            <w:enabled/>
+            <w:calcOnExit w:val="0"/>
+            <w:textInput/>
+          </w:ffData>
+        </w:fldChar>
+      </w:r>
+      <w:r>
+        <w:rPr>
+          <w:rFonts w:ascii="Arial" w:hAnsi="Arial" w:cs="Arial"/>
+          <w:bCs/>
+          <w:sz w:val="22"/>
+          <w:szCs w:val="22"/>
+        </w:rPr>
+        <w:instrText xml:space="preserve"> FORMTEXT </w:instrText>
+      </w:r>
+      <w:r>
+        <w:rPr>
+          <w:rFonts w:ascii="Arial" w:hAnsi="Arial" w:cs="Arial"/>
+          <w:bCs/>
+          <w:sz w:val="22"/>
+          <w:szCs w:val="22"/>
+        </w:rPr>
+      </w:r>
+      <w:r>
+        <w:rPr>
+          <w:rFonts w:ascii="Arial" w:hAnsi="Arial" w:cs="Arial"/>
+          <w:bCs/>
+          <w:sz w:val="22"/>
+          <w:szCs w:val="22"/>
+        </w:rPr>
+        <w:fldChar w:fldCharType="separate"/>
       </w:r>
       <w:r>
         <w:rPr>
@@ -521,15 +553,16 @@
           <w:sz w:val="22"/>
           <w:szCs w:val="22"/>
         </w:rPr>
-        <w:t>Hugo Ferreira</w:t>
-      </w:r>
-      <w:r>
-        <w:rPr>
-          <w:rFonts w:ascii="Arial" w:hAnsi="Arial" w:cs="Arial"/>
-          <w:bCs/>
-          <w:sz w:val="22"/>
-          <w:szCs w:val="22"/>
-        </w:rPr>
+        <w:t>Hélder Bastos</w:t>
+      </w:r>
+      <w:r>
+        <w:rPr>
+          <w:rFonts w:ascii="Arial" w:hAnsi="Arial" w:cs="Arial"/>
+          <w:bCs/>
+          <w:sz w:val="22"/>
+          <w:szCs w:val="22"/>
+        </w:rPr>
+        <w:fldChar w:fldCharType="end"/>
       </w:r>
     </w:p>
     <w:p>
@@ -754,7 +787,7 @@
           <w:sz w:val="22"/>
           <w:szCs w:val="22"/>
         </w:rPr>
-        <w:t>Lisboa, 25/03/2024</w:t>
+        <w:t>Lisboa, 19/03/2024</w:t>
       </w:r>
     </w:p>
     <w:p>
@@ -856,7 +889,7 @@
           <w:sz w:val="22"/>
           <w:szCs w:val="22"/>
         </w:rPr>
-        <w:t>Hugo Ferreira</w:t>
+        <w:t>Hélder Bastos</w:t>
       </w:r>
       <w:r>
         <w:rPr>

</xml_diff>